<commit_message>
docs: expand questionnaire testing and DevOps examples
Co-authored-by: Copilot <223556219+Copilot@users.noreply.github.com>
</commit_message>
<xml_diff>
--- a/Questionnaire_Suggested_Responses.docx
+++ b/Questionnaire_Suggested_Responses.docx
@@ -48,7 +48,7 @@
         <w:keepLines/>
       </w:pPr>
       <w:r>
-        <w:t>To me, AI-First SDLC means deciding from the beginning what AI should do, what normal code should control, and how the result will be tested and governed. It is different from adding a chatbot or API after the main application is already designed.</w:t>
+        <w:t>To me, AI-First SDLC means designing both the product and the delivery process around AI from the beginning. I decide where AI adds value, where deterministic code is required, how prompts and context are managed, and how the result will be tested and governed. It is more than adding an AI API to a finished application.</w:t>
       </w:r>
     </w:p>
     <w:p>
@@ -56,7 +56,7 @@
         <w:keepLines/>
       </w:pPr>
       <w:r>
-        <w:t>I applied this in Smart Backlog Assistant. The solution was designed around five focused AI agents for planning, requirement analysis, backlog comparison, story writing, and quality review. At the same time, file loading, schema validation, backlog IDs, limits, and final approval are controlled by deterministic Python code. I also used a specification-first approach with a project constitution, feature spec, technical plan, contracts, and tasks. This made AI part of the product architecture and the development process, not an add-on.</w:t>
+        <w:t>In Smart Backlog Assistant, I used a spec-driven approach. The constitution defines rules such as evidence before generation and mandatory human approval. The feature spec contains user journeys, Given/When/Then scenarios, functional requirements, and measurable outcomes. The plan and tasks link those requirements to the five-agent design, code, and tests. This means testing is derived from the specification, while DevOps gates can run the spec validator, pytest suite, package checks, and approval checks before a release.</w:t>
       </w:r>
     </w:p>
     <w:p>
@@ -80,7 +80,7 @@
         <w:keepLines/>
       </w:pPr>
       <w:r>
-        <w:t>I started by defining the problem and realistic use cases. I then created the architecture, prompt strategy, data contracts, guardrails, and test scenarios. During implementation I used Microsoft Agent Framework, Pydantic models, controlled tools, and OpenAI or Azure OpenAI support. I packaged it as a Python CLI with JSON and Markdown outputs.</w:t>
+        <w:t>I started with the problem statement and realistic use cases, then created a Spec Kit constitution, feature spec, technical plan, contracts, and task list. Acceptance scenarios in the spec became loader, workflow, guardrail, fallback, and immutability tests. I implemented the application with Microsoft Agent Framework, Pydantic, and OpenAI or Azure OpenAI support, and packaged it as an installable Python CLI with environment-based configuration, JSON and Markdown outputs, and rotating logs.</w:t>
       </w:r>
     </w:p>
     <w:p>
@@ -88,7 +88,7 @@
         <w:keepLines/>
       </w:pPr>
       <w:r>
-        <w:t>AI helped most in interpreting unstructured requirements and drafting clear stories. It also helped me refine the design, produce the Spec Kit artifacts, identify edge cases, and improve tests and documentation. Final decisions still pass deterministic checks and require human review.</w:t>
+        <w:t>For delivery, the repository is ready for a CI/CD pipeline even though one is not included yet. My pipeline design would run the PowerShell spec validator, pytest, package build, secret and dependency checks, and an offline smoke test before publishing an artifact. Live deployment would use protected secrets and a manual approval gate. AI helped most with requirement interpretation, design alternatives, prompt refinement, edge-case discovery, and documentation.</w:t>
       </w:r>
     </w:p>
     <w:p>
@@ -240,7 +240,7 @@
         <w:keepLines/>
       </w:pPr>
       <w:r>
-        <w:t>For debugging, I use the correlation ID, the tool audit, and targeted pytest cases that simulate failures and invalid model output.</w:t>
+        <w:t>For debugging, I use the correlation ID, tool audit, and targeted pytest cases. In a DevOps pipeline I would publish test results and the offline smoke-test proposal as build evidence, then monitor failure rate, fallback rate, validation errors, latency, and provider errors in each environment.</w:t>
       </w:r>
     </w:p>
     <w:p>
@@ -384,7 +384,7 @@
         <w:keepLines/>
       </w:pPr>
       <w:r>
-        <w:t>I used AI mainly in requirements and design, implementation, and testing.</w:t>
+        <w:t>I used AI across specification and design, implementation and testing, and delivery planning.</w:t>
       </w:r>
     </w:p>
     <w:p>
@@ -392,7 +392,7 @@
         <w:keepLines/>
       </w:pPr>
       <w:r>
-        <w:t>For requirements and design, AI helped me turn the project theme into specific user journeys, edge cases, success criteria, and a five-agent architecture. I used Spec Kit to capture the constitution, feature specification, implementation plan, contracts, and task traceability.</w:t>
+        <w:t>For specification and design, AI helped turn the project theme into user journeys, Given/When/Then acceptance scenarios, functional requirements, success measures, architecture choices, and a Spec Kit plan. During implementation, AI assistance helped me explore Agent Framework APIs, structure prompts, create typed models, and keep the package layered. I reviewed the output and kept evidence loading, validation, and approval controls deterministic.</w:t>
       </w:r>
     </w:p>
     <w:p>
@@ -400,7 +400,7 @@
         <w:keepLines/>
       </w:pPr>
       <w:r>
-        <w:t>During implementation, AI assistance helped me explore Agent Framework APIs, structure prompts, create typed models, and keep the package layered. I reviewed the code and kept validation and file handling deterministic. During testing, AI helped generate failure cases such as missing tool calls, invalid IDs, invented requirements, timeout fallback, and backlog immutability. I then ran the tests and used the results to refine the guardrails and documentation.</w:t>
+        <w:t>Testing was spec-driven: tests cover the behaviors written in the spec, including PDF loading, grounded requirements, valid backlog IDs, action mapping, exactly-once tool calls, fallback, logging, and backlog immutability. For DevOps, I defined repeatable PowerShell setup and validation, environment-based provider configuration, offline smoke testing, and the expected CI/CD gates. A release should proceed only after spec validation, pytest, package and security checks, and human approval for live configuration.</w:t>
       </w:r>
     </w:p>
     <w:p>
@@ -456,7 +456,7 @@
         <w:keepLines/>
       </w:pPr>
       <w:r>
-        <w:t>Smart Backlog Assistant uses Human-in-the-Loop for the business outcome. It creates proposals only, sets `approval_required` to true, and has no tool that publishes to a live backlog. A product owner must review the stories before any backlog change.</w:t>
+        <w:t>Smart Backlog Assistant uses Human-in-the-Loop for the business outcome. It creates proposals only, sets `approval_required` to true, and has no tool that publishes to a live backlog. A product owner must review the stories before any backlog change. The same principle applies in DevOps: a pipeline can build, test, and prepare an artifact automatically, but promotion to a live environment can require approval.</w:t>
       </w:r>
     </w:p>
     <w:p>
@@ -464,7 +464,7 @@
         <w:keepLines/>
       </w:pPr>
       <w:r>
-        <w:t>A Human-on-the-Loop example would be allowing the assistant to process documents and generate draft proposals automatically while the team monitors logs, quality metrics, and fallback rates. I would use this for low-risk draft generation, but keep human approval for publishing, security changes, or other irreversible actions.</w:t>
+        <w:t>Human-on-the-Loop fits lower-risk work such as automatically processing documents, running offline tests, and generating draft proposals while the team watches logs and quality metrics. I would keep human approval for publishing backlog items, changing security configuration, or deploying a model or prompt change to production.</w:t>
       </w:r>
     </w:p>
     <w:sectPr>

</xml_diff>

<commit_message>
docs: clarify AI-first testing approach
Co-authored-by: Copilot <223556219+Copilot@users.noreply.github.com>
</commit_message>
<xml_diff>
--- a/Questionnaire_Suggested_Responses.docx
+++ b/Questionnaire_Suggested_Responses.docx
@@ -48,7 +48,7 @@
         <w:keepLines/>
       </w:pPr>
       <w:r>
-        <w:t>To me, AI-First SDLC means designing both the product and the delivery process around AI from the beginning. I decide where AI adds value, where deterministic code is required, how prompts and context are managed, and how the result will be tested and governed. It is more than adding an AI API to a finished application.</w:t>
+        <w:t>To me, AI-First SDLC means designing the product and the delivery process around AI from the beginning. I decide where AI adds value, where normal code must remain in control, and how AI behavior will be specified, tested, monitored, and governed. It is more than adding a chatbot or API after the main application is built.</w:t>
       </w:r>
     </w:p>
     <w:p>
@@ -56,7 +56,7 @@
         <w:keepLines/>
       </w:pPr>
       <w:r>
-        <w:t>In Smart Backlog Assistant, I used a spec-driven approach. The constitution defines rules such as evidence before generation and mandatory human approval. The feature spec contains user journeys, Given/When/Then scenarios, functional requirements, and measurable outcomes. The plan and tasks link those requirements to the five-agent design, code, and tests. This means testing is derived from the specification, while DevOps gates can run the spec validator, pytest suite, package checks, and approval checks before a release.</w:t>
+        <w:t>I applied this in Smart Backlog Assistant. Five focused agents handle planning, requirement analysis, backlog comparison, story writing, and quality review, while deterministic Python controls evidence, IDs, limits, and approval. I used Spec Kit to define user journeys and Given/When/Then acceptance scenarios, then mapped them to pytest cases for PDF loading, hallucinated requirements, unknown backlog IDs, missing tool calls, fallback, logging, and backlog immutability. AI helped identify edge cases and draft tests, but deterministic assertions decide whether the build passes. These checks, the PowerShell spec validator, and an offline smoke test form the CI quality gates.</w:t>
       </w:r>
     </w:p>
     <w:p>

</xml_diff>

<commit_message>
docs: frame questionnaire around spec-first delivery
Co-authored-by: Copilot <223556219+Copilot@users.noreply.github.com>
</commit_message>
<xml_diff>
--- a/Questionnaire_Suggested_Responses.docx
+++ b/Questionnaire_Suggested_Responses.docx
@@ -48,7 +48,7 @@
         <w:keepLines/>
       </w:pPr>
       <w:r>
-        <w:t>To me, AI-First SDLC means designing the product and the delivery process around AI from the beginning. I decide where AI adds value, where normal code must remain in control, and how AI behavior will be specified, tested, monitored, and governed. It is more than adding a chatbot or API after the main application is built.</w:t>
+        <w:t>To me, AI-First SDLC means using AI across the complete lifecycle, not only inside the final application. I start by describing the expected behavior as a specification, use that approved specification to guide implementation and testing, and keep a person responsible for reviewing and accepting the result.</w:t>
       </w:r>
     </w:p>
     <w:p>
@@ -56,7 +56,7 @@
         <w:keepLines/>
       </w:pPr>
       <w:r>
-        <w:t>I applied this in Smart Backlog Assistant. Five focused agents handle planning, requirement analysis, backlog comparison, story writing, and quality review, while deterministic Python controls evidence, IDs, limits, and approval. I used Spec Kit to define user journeys and Given/When/Then acceptance scenarios. AI then generated the initial pytest cases, negative guardrail tests for hallucinated requirements, unknown backlog IDs, missing tool calls and timeouts, and an evaluation matrix covering six realistic scenarios. I reviewed these outputs and implemented the final guardrails as deterministic checks, so AI helped create the tests and evaluations but code decides pass or fail. The PowerShell spec validator, pytest suite, and offline smoke test can then act as CI quality gates.</w:t>
+        <w:t>For Smart Backlog Assistant, I first used Spec Kit to generate the constitution, user stories, Given/When/Then acceptance scenarios, functional requirements, technical plan, contracts, and implementation tasks. After reviewing that baseline, I used AI assistance to implement the application stage by stage. AI also generated initial pytest cases, guardrail scenarios, and the six-scenario evaluation set. I manually reviewed the code and outputs against the specification, ran the automated tests, and completed a manual end-to-end test with sample inputs and generated JSON and Markdown outputs before accepting the solution. This gave me traceability from specification to code, tests, evaluation, and manual sign-off.</w:t>
       </w:r>
     </w:p>
     <w:p>

</xml_diff>